<commit_message>
docs: generate updated Word document guide (.docx) and deploy
</commit_message>
<xml_diff>
--- a/public/docs/The-Ship-Inn-CMS-User-Manual.docx
+++ b/public/docs/The-Ship-Inn-CMS-User-Manual.docx
@@ -19,7 +19,7 @@
     </w:p>
     <w:p>
       <w:pPr>
-        <w:spacing w:after="200"/>
+        <w:spacing w:after="140"/>
         <w:jc w:val="center"/>
       </w:pPr>
       <w:r>
@@ -30,12 +30,12 @@
           <w:sz w:val="40"/>
           <w:szCs w:val="40"/>
         </w:rPr>
-        <w:t xml:space="preserve">CMS User Manual &amp; Client Guide</w:t>
-      </w:r>
-    </w:p>
-    <w:p>
-      <w:pPr>
-        <w:spacing w:after="400"/>
+        <w:t xml:space="preserve">Website &amp; Content Management Guide</w:t>
+      </w:r>
+    </w:p>
+    <w:p>
+      <w:pPr>
+        <w:spacing w:after="300"/>
         <w:jc w:val="center"/>
       </w:pPr>
       <w:r>
@@ -55,46 +55,7 @@
           <w:sz w:val="22"/>
           <w:szCs w:val="22"/>
         </w:rPr>
-        <w:t xml:space="preserve">Outstatic CMS &amp; Admin Tools</w:t>
-      </w:r>
-    </w:p>
-    <w:p>
-      <w:pPr>
-        <w:spacing w:after="280"/>
-      </w:pPr>
-      <w:r>
-        <w:rPr>
-          <w:sz w:val="22"/>
-          <w:szCs w:val="22"/>
-        </w:rPr>
-        <w:t xml:space="preserve">This is the definitive instruction manual for managing your website, updating downloadable menus, adding gallery photos, and editing pages on </w:t>
-      </w:r>
-      <w:r>
-        <w:rPr>
-          <w:b/>
-          <w:bCs/>
-          <w:color w:val="1E3A8A"/>
-        </w:rPr>
-        <w:t xml:space="preserve">theshipinnporlockweir.co.uk</w:t>
-      </w:r>
-      <w:r>
-        <w:t xml:space="preserve">.</w:t>
-      </w:r>
-    </w:p>
-    <w:p>
-      <w:pPr>
-        <w:pStyle w:val="Heading2"/>
-        <w:spacing w:after="140" w:before="300"/>
-      </w:pPr>
-      <w:r>
-        <w:rPr>
-          <w:b/>
-          <w:bCs/>
-          <w:color w:val="1E3A8A"/>
-          <w:sz w:val="28"/>
-          <w:szCs w:val="28"/>
-        </w:rPr>
-        <w:t xml:space="preserve">1. How to Log In</w:t>
+        <w:t xml:space="preserve">Dedicated Admin Tools &amp; Outstatic CMS</w:t>
       </w:r>
     </w:p>
     <w:tbl>
@@ -116,12 +77,12 @@
         <w:tc>
           <w:tcPr>
             <w:tcBorders>
-              <w:top w:val="single" w:color="E2E8F0" w:sz="6"/>
-              <w:left w:val="single" w:color="1E3A8A" w:sz="24"/>
-              <w:bottom w:val="single" w:color="E2E8F0" w:sz="6"/>
-              <w:right w:val="single" w:color="E2E8F0" w:sz="6"/>
-            </w:tcBorders>
-            <w:shd w:fill="F8FAFC" w:val="clear"/>
+              <w:top w:val="single" w:color="BFDBFE" w:sz="6"/>
+              <w:left w:val="single" w:color="1E3A8A" w:sz="36"/>
+              <w:bottom w:val="single" w:color="BFDBFE" w:sz="6"/>
+              <w:right w:val="single" w:color="BFDBFE" w:sz="6"/>
+            </w:tcBorders>
+            <w:shd w:fill="EFF6FF" w:val="clear"/>
             <w:tcMar>
               <w:top w:type="dxa" w:w="140"/>
               <w:left w:type="dxa" w:w="200"/>
@@ -131,62 +92,56 @@
           </w:tcPr>
           <w:p>
             <w:pPr>
-              <w:spacing w:after="60"/>
-            </w:pPr>
-            <w:r>
-              <w:rPr>
-                <w:b w:val="false"/>
-                <w:bCs w:val="false"/>
-                <w:color w:val="334155"/>
-                <w:sz w:val="21"/>
-                <w:szCs w:val="21"/>
-              </w:rPr>
-              <w:t xml:space="preserve">1. In your web browser, go to: https://theshipinnporlockweir.co.uk/outstatic</w:t>
-            </w:r>
-          </w:p>
-          <w:p>
-            <w:pPr>
-              <w:spacing w:after="60"/>
-            </w:pPr>
-            <w:r>
-              <w:rPr>
-                <w:b w:val="false"/>
-                <w:bCs w:val="false"/>
-                <w:color w:val="334155"/>
-                <w:sz w:val="21"/>
-                <w:szCs w:val="21"/>
-              </w:rPr>
-              <w:t xml:space="preserve">2. Click "Sign in with GitHub".</w:t>
-            </w:r>
-          </w:p>
-          <w:p>
-            <w:pPr>
-              <w:spacing w:after="60"/>
-            </w:pPr>
-            <w:r>
-              <w:rPr>
-                <w:b w:val="false"/>
-                <w:bCs w:val="false"/>
-                <w:color w:val="334155"/>
-                <w:sz w:val="21"/>
-                <w:szCs w:val="21"/>
-              </w:rPr>
-              <w:t xml:space="preserve">3. Enter Username: hello@theshipinnporlockweir.co.uk and Password: theshipinnta248pb!</w:t>
-            </w:r>
-          </w:p>
-          <w:p>
-            <w:pPr>
-              <w:spacing w:after="60"/>
-            </w:pPr>
-            <w:r>
-              <w:rPr>
-                <w:b w:val="false"/>
-                <w:bCs w:val="false"/>
-                <w:color w:val="334155"/>
-                <w:sz w:val="21"/>
-                <w:szCs w:val="21"/>
-              </w:rPr>
-              <w:t xml:space="preserve">4. If prompted on screen, click "Authorize".</w:t>
+              <w:spacing w:after="100"/>
+            </w:pPr>
+            <w:r>
+              <w:rPr>
+                <w:b/>
+                <w:bCs/>
+                <w:color w:val="1E3A8A"/>
+                <w:sz w:val="24"/>
+                <w:szCs w:val="24"/>
+              </w:rPr>
+              <w:t xml:space="preserve">⚡ Fast Track: Which Tool to Use?</w:t>
+            </w:r>
+          </w:p>
+          <w:p>
+            <w:pPr>
+              <w:spacing w:after="60"/>
+            </w:pPr>
+            <w:r>
+              <w:rPr>
+                <w:color w:val="1E3A8A"/>
+                <w:sz w:val="21"/>
+                <w:szCs w:val="21"/>
+              </w:rPr>
+              <w:t xml:space="preserve">• To Upload or Update PDF Menus: Use the Menu Manager (https://theshipinnporlockweir.co.uk/admin/menus)</w:t>
+            </w:r>
+          </w:p>
+          <w:p>
+            <w:pPr>
+              <w:spacing w:after="60"/>
+            </w:pPr>
+            <w:r>
+              <w:rPr>
+                <w:color w:val="1E3A8A"/>
+                <w:sz w:val="21"/>
+                <w:szCs w:val="21"/>
+              </w:rPr>
+              <w:t xml:space="preserve">• To Add or Remove Gallery Photos: Use the Gallery Manager (https://theshipinnporlockweir.co.uk/admin/gallery)</w:t>
+            </w:r>
+          </w:p>
+          <w:p>
+            <w:pPr>
+              <w:spacing w:after="60"/>
+            </w:pPr>
+            <w:r>
+              <w:rPr>
+                <w:color w:val="1E3A8A"/>
+                <w:sz w:val="21"/>
+                <w:szCs w:val="21"/>
+              </w:rPr>
+              <w:t xml:space="preserve">• To Edit Page Text, Hours, Contact Info, News, or Events: Use Outstatic CMS (https://theshipinnporlockweir.co.uk/outstatic)</w:t>
             </w:r>
           </w:p>
         </w:tc>
@@ -205,140 +160,24 @@
           <w:sz w:val="28"/>
           <w:szCs w:val="28"/>
         </w:rPr>
-        <w:t xml:space="preserve">2. Understanding the Dashboard</w:t>
-      </w:r>
-    </w:p>
-    <w:p>
-      <w:r>
-        <w:t xml:space="preserve">The left sidebar of your Outstatic dashboard gives you access to all key website sections:</w:t>
-      </w:r>
-    </w:p>
-    <w:p>
-      <w:pPr>
-        <w:pStyle w:val="ListParagraph"/>
-        <w:numPr>
-          <w:ilvl w:val="0"/>
-          <w:numId w:val="1"/>
-        </w:numPr>
-        <w:spacing w:after="80"/>
-      </w:pPr>
-      <w:r>
-        <w:rPr>
-          <w:sz w:val="22"/>
-          <w:szCs w:val="22"/>
-        </w:rPr>
-        <w:t xml:space="preserve">Pages — Controls core website content (Home, Food &amp; Drink, Contact, Rooms, etc.).</w:t>
-      </w:r>
-    </w:p>
-    <w:p>
-      <w:pPr>
-        <w:pStyle w:val="ListParagraph"/>
-        <w:numPr>
-          <w:ilvl w:val="0"/>
-          <w:numId w:val="1"/>
-        </w:numPr>
-        <w:spacing w:after="80"/>
-      </w:pPr>
-      <w:r>
-        <w:rPr>
-          <w:sz w:val="22"/>
-          <w:szCs w:val="22"/>
-        </w:rPr>
-        <w:t xml:space="preserve">Menus — Displays and manages all downloadable food &amp; drink PDF menus.</w:t>
-      </w:r>
-    </w:p>
-    <w:p>
-      <w:pPr>
-        <w:pStyle w:val="ListParagraph"/>
-        <w:numPr>
-          <w:ilvl w:val="0"/>
-          <w:numId w:val="1"/>
-        </w:numPr>
-        <w:spacing w:after="80"/>
-      </w:pPr>
-      <w:r>
-        <w:rPr>
-          <w:sz w:val="22"/>
-          <w:szCs w:val="22"/>
-        </w:rPr>
-        <w:t xml:space="preserve">Gallery — Controls all photos and categories shown on the Photo Gallery page.</w:t>
-      </w:r>
-    </w:p>
-    <w:p>
-      <w:pPr>
-        <w:pStyle w:val="ListParagraph"/>
-        <w:numPr>
-          <w:ilvl w:val="0"/>
-          <w:numId w:val="1"/>
-        </w:numPr>
-        <w:spacing w:after="80"/>
-      </w:pPr>
-      <w:r>
-        <w:rPr>
-          <w:sz w:val="22"/>
-          <w:szCs w:val="22"/>
-        </w:rPr>
-        <w:t xml:space="preserve">Events — Displays and schedules upcoming live music, pub events, and promotions.</w:t>
-      </w:r>
-    </w:p>
-    <w:p>
-      <w:pPr>
-        <w:pStyle w:val="ListParagraph"/>
-        <w:numPr>
-          <w:ilvl w:val="0"/>
-          <w:numId w:val="1"/>
-        </w:numPr>
-        <w:spacing w:after="80"/>
-      </w:pPr>
-      <w:r>
-        <w:rPr>
-          <w:sz w:val="22"/>
-          <w:szCs w:val="22"/>
-        </w:rPr>
-        <w:t xml:space="preserve">News — Controls articles and news updates.</w:t>
-      </w:r>
-    </w:p>
-    <w:p>
-      <w:pPr>
-        <w:pStyle w:val="ListParagraph"/>
-        <w:numPr>
-          <w:ilvl w:val="0"/>
-          <w:numId w:val="1"/>
-        </w:numPr>
-        <w:spacing w:after="80"/>
-      </w:pPr>
-      <w:r>
-        <w:rPr>
-          <w:sz w:val="22"/>
-          <w:szCs w:val="22"/>
-        </w:rPr>
-        <w:t xml:space="preserve">Media Library — Central repository for all uploaded images.</w:t>
-      </w:r>
-    </w:p>
-    <w:p>
-      <w:pPr>
-        <w:pStyle w:val="Heading2"/>
-        <w:spacing w:after="140" w:before="300"/>
-      </w:pPr>
+        <w:t xml:space="preserve">1. Dedicated Fast Admin Tools (1-Minute Updates)</w:t>
+      </w:r>
+    </w:p>
+    <w:p>
       <w:r>
         <w:rPr>
           <w:b/>
           <w:bCs/>
           <w:color w:val="1E3A8A"/>
-          <w:sz w:val="28"/>
-          <w:szCs w:val="28"/>
-        </w:rPr>
-        <w:t xml:space="preserve">3. How to Upload and Use Images in Outstatic</w:t>
-      </w:r>
-    </w:p>
-    <w:p>
-      <w:r>
-        <w:rPr>
-          <w:b/>
-          <w:bCs/>
-          <w:color w:val="1E3A8A"/>
-        </w:rPr>
-        <w:t xml:space="preserve">Step 1: Uploading Images to the Media Library</w:t>
+          <w:sz w:val="24"/>
+          <w:szCs w:val="24"/>
+        </w:rPr>
+        <w:t xml:space="preserve">1.1 Menu Manager &amp; PDF Uploader</w:t>
+      </w:r>
+    </w:p>
+    <w:p>
+      <w:r>
+        <w:t xml:space="preserve">Use this dedicated tool whenever you have a new season or updated menu PDF:</w:t>
       </w:r>
     </w:p>
     <w:tbl>
@@ -385,7 +224,7 @@
                 <w:sz w:val="21"/>
                 <w:szCs w:val="21"/>
               </w:rPr>
-              <w:t xml:space="preserve">1. In the left sidebar, click Media Library.</w:t>
+              <w:t xml:space="preserve">1. Open your browser and go to: https://theshipinnporlockweir.co.uk/admin/menus</w:t>
             </w:r>
           </w:p>
           <w:p>
@@ -400,7 +239,7 @@
                 <w:sz w:val="21"/>
                 <w:szCs w:val="21"/>
               </w:rPr>
-              <w:t xml:space="preserve">2. Click "Add Media" and choose the image from your computer (.webp, .jpg, .png).</w:t>
+              <w:t xml:space="preserve">2. Click the menu you want to update (Breakfast Menu, Lunch Menu, Evening Menu, Sunday Lunch Menu, or Custom Menu).</w:t>
             </w:r>
           </w:p>
           <w:p>
@@ -415,20 +254,60 @@
                 <w:sz w:val="21"/>
                 <w:szCs w:val="21"/>
               </w:rPr>
-              <w:t xml:space="preserve">3. The photo will appear immediately in your media library.</w:t>
+              <w:t xml:space="preserve">3. Enter the Season / Subtitle (e.g. "Autumn 2026" or "Served 12:00 PM – 3:00 PM").</w:t>
+            </w:r>
+          </w:p>
+          <w:p>
+            <w:pPr>
+              <w:spacing w:after="60"/>
+            </w:pPr>
+            <w:r>
+              <w:rPr>
+                <w:b w:val="false"/>
+                <w:bCs w:val="false"/>
+                <w:color w:val="334155"/>
+                <w:sz w:val="21"/>
+                <w:szCs w:val="21"/>
+              </w:rPr>
+              <w:t xml:space="preserve">4. Click "Browse PDF file" and choose your .pdf file.</w:t>
+            </w:r>
+          </w:p>
+          <w:p>
+            <w:pPr>
+              <w:spacing w:after="60"/>
+            </w:pPr>
+            <w:r>
+              <w:rPr>
+                <w:b w:val="false"/>
+                <w:bCs w:val="false"/>
+                <w:color w:val="334155"/>
+                <w:sz w:val="21"/>
+                <w:szCs w:val="21"/>
+              </w:rPr>
+              <w:t xml:space="preserve">5. Click "Upload &amp; Publish Menu". The live website and Outstatic update automatically in 1–2 minutes!</w:t>
             </w:r>
           </w:p>
         </w:tc>
       </w:tr>
     </w:tbl>
     <w:p>
+      <w:pPr>
+        <w:spacing w:before="200"/>
+      </w:pPr>
       <w:r>
         <w:rPr>
           <w:b/>
           <w:bCs/>
           <w:color w:val="1E3A8A"/>
-        </w:rPr>
-        <w:t xml:space="preserve">Step 2: Assigning Images to Pages</w:t>
+          <w:sz w:val="24"/>
+          <w:szCs w:val="24"/>
+        </w:rPr>
+        <w:t xml:space="preserve">1.2 Gallery Manager &amp; Photo Uploader</w:t>
+      </w:r>
+    </w:p>
+    <w:p>
+      <w:r>
+        <w:t xml:space="preserve">Use this dedicated tool to upload new photos to the gallery without having to manually copy file links:</w:t>
       </w:r>
     </w:p>
     <w:tbl>
@@ -469,28 +348,118 @@
             </w:pPr>
             <w:r>
               <w:rPr>
-                <w:b/>
-                <w:bCs/>
-                <w:color w:val="1E3A8A"/>
-                <w:sz w:val="21"/>
-                <w:szCs w:val="21"/>
-              </w:rPr>
-              <w:t xml:space="preserve">• Cover Images (Standard Pages): Click the Cover Image box in the right sidebar, pick your photo from the Media Library, and click Save.</w:t>
-            </w:r>
-          </w:p>
-          <w:p>
-            <w:pPr>
-              <w:spacing w:after="60"/>
-            </w:pPr>
-            <w:r>
-              <w:rPr>
                 <w:b w:val="false"/>
                 <w:bCs w:val="false"/>
                 <w:color w:val="334155"/>
                 <w:sz w:val="21"/>
                 <w:szCs w:val="21"/>
               </w:rPr>
-              <w:t xml:space="preserve">• Hero Rotating Images (Home Page): Copy the image path from the Media Library (e.g., /images/ship-inn.webp) and paste it into Hero Image 1, 2, or 3.</w:t>
+              <w:t xml:space="preserve">1. Open your browser and go to: https://theshipinnporlockweir.co.uk/admin/gallery</w:t>
+            </w:r>
+          </w:p>
+          <w:p>
+            <w:pPr>
+              <w:spacing w:after="60"/>
+            </w:pPr>
+            <w:r>
+              <w:rPr>
+                <w:b w:val="false"/>
+                <w:bCs w:val="false"/>
+                <w:color w:val="334155"/>
+                <w:sz w:val="21"/>
+                <w:szCs w:val="21"/>
+              </w:rPr>
+              <w:t xml:space="preserve">2. Choose your upload mode:</w:t>
+            </w:r>
+          </w:p>
+          <w:p>
+            <w:pPr>
+              <w:spacing w:after="60"/>
+            </w:pPr>
+            <w:r>
+              <w:rPr>
+                <w:b w:val="false"/>
+                <w:bCs w:val="false"/>
+                <w:color w:val="334155"/>
+                <w:sz w:val="21"/>
+                <w:szCs w:val="21"/>
+              </w:rPr>
+              <w:t xml:space="preserve">   • Single Photo Upload: Add an individual photo with a custom title and caption.</w:t>
+            </w:r>
+          </w:p>
+          <w:p>
+            <w:pPr>
+              <w:spacing w:after="60"/>
+            </w:pPr>
+            <w:r>
+              <w:rPr>
+                <w:b w:val="false"/>
+                <w:bCs w:val="false"/>
+                <w:color w:val="334155"/>
+                <w:sz w:val="21"/>
+                <w:szCs w:val="21"/>
+              </w:rPr>
+              <w:t xml:space="preserve">   • Batch Upload: Upload 3–10 photos at once into a chosen category.</w:t>
+            </w:r>
+          </w:p>
+          <w:p>
+            <w:pPr>
+              <w:spacing w:after="60"/>
+            </w:pPr>
+            <w:r>
+              <w:rPr>
+                <w:b w:val="false"/>
+                <w:bCs w:val="false"/>
+                <w:color w:val="334155"/>
+                <w:sz w:val="21"/>
+                <w:szCs w:val="21"/>
+              </w:rPr>
+              <w:t xml:space="preserve">3. Click the matching category button (Food &amp; Drink, Interior &amp; Bar, Exterior &amp; Garden, Rooms &amp; Cabins, Surroundings, or Custom).</w:t>
+            </w:r>
+          </w:p>
+          <w:p>
+            <w:pPr>
+              <w:spacing w:after="60"/>
+            </w:pPr>
+            <w:r>
+              <w:rPr>
+                <w:b w:val="false"/>
+                <w:bCs w:val="false"/>
+                <w:color w:val="334155"/>
+                <w:sz w:val="21"/>
+                <w:szCs w:val="21"/>
+              </w:rPr>
+              <w:t xml:space="preserve">4. Click "Browse Image" to select your photo (.webp, .jpg, .png, .avif) and verify the instant preview thumbnail.</w:t>
+            </w:r>
+          </w:p>
+          <w:p>
+            <w:pPr>
+              <w:spacing w:after="60"/>
+            </w:pPr>
+            <w:r>
+              <w:rPr>
+                <w:b w:val="false"/>
+                <w:bCs w:val="false"/>
+                <w:color w:val="334155"/>
+                <w:sz w:val="21"/>
+                <w:szCs w:val="21"/>
+              </w:rPr>
+              <w:t xml:space="preserve">5. Enter a descriptive Photo Title and optional Caption.</w:t>
+            </w:r>
+          </w:p>
+          <w:p>
+            <w:pPr>
+              <w:spacing w:after="60"/>
+            </w:pPr>
+            <w:r>
+              <w:rPr>
+                <w:b w:val="false"/>
+                <w:bCs w:val="false"/>
+                <w:color w:val="334155"/>
+                <w:sz w:val="21"/>
+                <w:szCs w:val="21"/>
+              </w:rPr>
+              <w:t xml:space="preserve">6. Click "Upload &amp; Publish Image". The photo goes live immediately and syncs with Outstatic CMS!</w:t>
             </w:r>
           </w:p>
         </w:tc>
@@ -509,7 +478,12 @@
           <w:sz w:val="28"/>
           <w:szCs w:val="28"/>
         </w:rPr>
-        <w:t xml:space="preserve">4. How to Edit and Save Any Page</w:t>
+        <w:t xml:space="preserve">2. How to Log In to Outstatic CMS</w:t>
+      </w:r>
+    </w:p>
+    <w:p>
+      <w:r>
+        <w:t xml:space="preserve">Use Outstatic CMS when you need to edit written text across website pages, change opening hours, post news stories, or add events:</w:t>
       </w:r>
     </w:p>
     <w:tbl>
@@ -556,7 +530,7 @@
                 <w:sz w:val="21"/>
                 <w:szCs w:val="21"/>
               </w:rPr>
-              <w:t xml:space="preserve">1. In the left sidebar, click Pages, then click the page you want to update.</w:t>
+              <w:t xml:space="preserve">1. In your browser, go to: https://theshipinnporlockweir.co.uk/outstatic</w:t>
             </w:r>
           </w:p>
           <w:p>
@@ -571,7 +545,7 @@
                 <w:sz w:val="21"/>
                 <w:szCs w:val="21"/>
               </w:rPr>
-              <w:t xml:space="preserve">2. Focus on the Right Sidebar fields. (The large center editor is for internal notes only).</w:t>
+              <w:t xml:space="preserve">2. Click "Sign in with GitHub".</w:t>
             </w:r>
           </w:p>
           <w:p>
@@ -586,7 +560,7 @@
                 <w:sz w:val="21"/>
                 <w:szCs w:val="21"/>
               </w:rPr>
-              <w:t xml:space="preserve">3. If a field shows "+ Create", click it to open the text input box.</w:t>
+              <w:t xml:space="preserve">3. Enter Username: hello@theshipinnporlockweir.co.uk and Password: theshipinnta248pb!</w:t>
             </w:r>
           </w:p>
           <w:p>
@@ -601,37 +575,7 @@
                 <w:sz w:val="21"/>
                 <w:szCs w:val="21"/>
               </w:rPr>
-              <w:t xml:space="preserve">4. Ensure Status is set to "Published" (not Draft).</w:t>
-            </w:r>
-          </w:p>
-          <w:p>
-            <w:pPr>
-              <w:spacing w:after="60"/>
-            </w:pPr>
-            <w:r>
-              <w:rPr>
-                <w:b w:val="false"/>
-                <w:bCs w:val="false"/>
-                <w:color w:val="334155"/>
-                <w:sz w:val="21"/>
-                <w:szCs w:val="21"/>
-              </w:rPr>
-              <w:t xml:space="preserve">5. Click the black "Save" button in the top-right corner.</w:t>
-            </w:r>
-          </w:p>
-          <w:p>
-            <w:pPr>
-              <w:spacing w:after="60"/>
-            </w:pPr>
-            <w:r>
-              <w:rPr>
-                <w:b w:val="false"/>
-                <w:bCs w:val="false"/>
-                <w:color w:val="334155"/>
-                <w:sz w:val="21"/>
-                <w:szCs w:val="21"/>
-              </w:rPr>
-              <w:t xml:space="preserve">6. Wait 1–2 minutes, then refresh your live website to see changes.</w:t>
+              <w:t xml:space="preserve">4. If prompted on screen, click "Authorize".</w:t>
             </w:r>
           </w:p>
         </w:tc>
@@ -650,7 +594,271 @@
           <w:sz w:val="28"/>
           <w:szCs w:val="28"/>
         </w:rPr>
-        <w:t xml:space="preserve">5. What Each Field Changes (Page by Page)</w:t>
+        <w:t xml:space="preserve">3. Understanding the Outstatic Dashboard</w:t>
+      </w:r>
+    </w:p>
+    <w:p>
+      <w:r>
+        <w:t xml:space="preserve">The left sidebar of your Outstatic dashboard provides access to all content sections:</w:t>
+      </w:r>
+    </w:p>
+    <w:p>
+      <w:pPr>
+        <w:pStyle w:val="ListParagraph"/>
+        <w:numPr>
+          <w:ilvl w:val="0"/>
+          <w:numId w:val="1"/>
+        </w:numPr>
+        <w:spacing w:after="80"/>
+      </w:pPr>
+      <w:r>
+        <w:rPr>
+          <w:sz w:val="22"/>
+          <w:szCs w:val="22"/>
+        </w:rPr>
+        <w:t xml:space="preserve">Pages — Controls text and banners on core website pages (Home, Food &amp; Drink, Contact, Rooms, etc.).</w:t>
+      </w:r>
+    </w:p>
+    <w:p>
+      <w:pPr>
+        <w:pStyle w:val="ListParagraph"/>
+        <w:numPr>
+          <w:ilvl w:val="0"/>
+          <w:numId w:val="1"/>
+        </w:numPr>
+        <w:spacing w:after="80"/>
+      </w:pPr>
+      <w:r>
+        <w:rPr>
+          <w:sz w:val="22"/>
+          <w:szCs w:val="22"/>
+        </w:rPr>
+        <w:t xml:space="preserve">Menus — Shows all uploaded menus (where you can toggle Draft/Published to temporarily hide a menu).</w:t>
+      </w:r>
+    </w:p>
+    <w:p>
+      <w:pPr>
+        <w:pStyle w:val="ListParagraph"/>
+        <w:numPr>
+          <w:ilvl w:val="0"/>
+          <w:numId w:val="1"/>
+        </w:numPr>
+        <w:spacing w:after="80"/>
+      </w:pPr>
+      <w:r>
+        <w:rPr>
+          <w:sz w:val="22"/>
+          <w:szCs w:val="22"/>
+        </w:rPr>
+        <w:t xml:space="preserve">Gallery — Shows your photo collection (where you can edit captions or toggle Draft/Published).</w:t>
+      </w:r>
+    </w:p>
+    <w:p>
+      <w:pPr>
+        <w:pStyle w:val="ListParagraph"/>
+        <w:numPr>
+          <w:ilvl w:val="0"/>
+          <w:numId w:val="1"/>
+        </w:numPr>
+        <w:spacing w:after="80"/>
+      </w:pPr>
+      <w:r>
+        <w:rPr>
+          <w:sz w:val="22"/>
+          <w:szCs w:val="22"/>
+        </w:rPr>
+        <w:t xml:space="preserve">Events — Add upcoming live music, pub quizzes, and seasonal celebrations.</w:t>
+      </w:r>
+    </w:p>
+    <w:p>
+      <w:pPr>
+        <w:pStyle w:val="ListParagraph"/>
+        <w:numPr>
+          <w:ilvl w:val="0"/>
+          <w:numId w:val="1"/>
+        </w:numPr>
+        <w:spacing w:after="80"/>
+      </w:pPr>
+      <w:r>
+        <w:rPr>
+          <w:sz w:val="22"/>
+          <w:szCs w:val="22"/>
+        </w:rPr>
+        <w:t xml:space="preserve">News — Post articles and announcements.</w:t>
+      </w:r>
+    </w:p>
+    <w:p>
+      <w:pPr>
+        <w:pStyle w:val="ListParagraph"/>
+        <w:numPr>
+          <w:ilvl w:val="0"/>
+          <w:numId w:val="1"/>
+        </w:numPr>
+        <w:spacing w:after="80"/>
+      </w:pPr>
+      <w:r>
+        <w:rPr>
+          <w:sz w:val="22"/>
+          <w:szCs w:val="22"/>
+        </w:rPr>
+        <w:t xml:space="preserve">Media Library — Central repository for all images used on website pages.</w:t>
+      </w:r>
+    </w:p>
+    <w:p>
+      <w:pPr>
+        <w:pStyle w:val="Heading2"/>
+        <w:spacing w:after="140" w:before="300"/>
+      </w:pPr>
+      <w:r>
+        <w:rPr>
+          <w:b/>
+          <w:bCs/>
+          <w:color w:val="1E3A8A"/>
+          <w:sz w:val="28"/>
+          <w:szCs w:val="28"/>
+        </w:rPr>
+        <w:t xml:space="preserve">4. How to Edit and Save Any Page in Outstatic</w:t>
+      </w:r>
+    </w:p>
+    <w:tbl>
+      <w:tblPr>
+        <w:tblW w:type="pct" w:w="100%"/>
+        <w:tblBorders>
+          <w:top w:val="single" w:color="auto" w:sz="4"/>
+          <w:left w:val="single" w:color="auto" w:sz="4"/>
+          <w:bottom w:val="single" w:color="auto" w:sz="4"/>
+          <w:right w:val="single" w:color="auto" w:sz="4"/>
+          <w:insideH w:val="single" w:color="auto" w:sz="4"/>
+          <w:insideV w:val="single" w:color="auto" w:sz="4"/>
+        </w:tblBorders>
+      </w:tblPr>
+      <w:tblGrid>
+        <w:gridCol w:w="100"/>
+      </w:tblGrid>
+      <w:tr>
+        <w:tc>
+          <w:tcPr>
+            <w:tcBorders>
+              <w:top w:val="single" w:color="E2E8F0" w:sz="6"/>
+              <w:left w:val="single" w:color="1E3A8A" w:sz="24"/>
+              <w:bottom w:val="single" w:color="E2E8F0" w:sz="6"/>
+              <w:right w:val="single" w:color="E2E8F0" w:sz="6"/>
+            </w:tcBorders>
+            <w:shd w:fill="F8FAFC" w:val="clear"/>
+            <w:tcMar>
+              <w:top w:type="dxa" w:w="140"/>
+              <w:left w:type="dxa" w:w="200"/>
+              <w:bottom w:type="dxa" w:w="140"/>
+              <w:right w:type="dxa" w:w="200"/>
+            </w:tcMar>
+          </w:tcPr>
+          <w:p>
+            <w:pPr>
+              <w:spacing w:after="60"/>
+            </w:pPr>
+            <w:r>
+              <w:rPr>
+                <w:b w:val="false"/>
+                <w:bCs w:val="false"/>
+                <w:color w:val="334155"/>
+                <w:sz w:val="21"/>
+                <w:szCs w:val="21"/>
+              </w:rPr>
+              <w:t xml:space="preserve">1. In the left sidebar, click Pages, then click the page you want to update.</w:t>
+            </w:r>
+          </w:p>
+          <w:p>
+            <w:pPr>
+              <w:spacing w:after="60"/>
+            </w:pPr>
+            <w:r>
+              <w:rPr>
+                <w:b w:val="false"/>
+                <w:bCs w:val="false"/>
+                <w:color w:val="334155"/>
+                <w:sz w:val="21"/>
+                <w:szCs w:val="21"/>
+              </w:rPr>
+              <w:t xml:space="preserve">2. Focus on the Right Sidebar fields. (The large center editor is not used for page layouts).</w:t>
+            </w:r>
+          </w:p>
+          <w:p>
+            <w:pPr>
+              <w:spacing w:after="60"/>
+            </w:pPr>
+            <w:r>
+              <w:rPr>
+                <w:b w:val="false"/>
+                <w:bCs w:val="false"/>
+                <w:color w:val="334155"/>
+                <w:sz w:val="21"/>
+                <w:szCs w:val="21"/>
+              </w:rPr>
+              <w:t xml:space="preserve">3. If a field shows "+ Create", click it to open the text input box.</w:t>
+            </w:r>
+          </w:p>
+          <w:p>
+            <w:pPr>
+              <w:spacing w:after="60"/>
+            </w:pPr>
+            <w:r>
+              <w:rPr>
+                <w:b w:val="false"/>
+                <w:bCs w:val="false"/>
+                <w:color w:val="334155"/>
+                <w:sz w:val="21"/>
+                <w:szCs w:val="21"/>
+              </w:rPr>
+              <w:t xml:space="preserve">4. Ensure Status is set to "Published" (not Draft).</w:t>
+            </w:r>
+          </w:p>
+          <w:p>
+            <w:pPr>
+              <w:spacing w:after="60"/>
+            </w:pPr>
+            <w:r>
+              <w:rPr>
+                <w:b w:val="false"/>
+                <w:bCs w:val="false"/>
+                <w:color w:val="334155"/>
+                <w:sz w:val="21"/>
+                <w:szCs w:val="21"/>
+              </w:rPr>
+              <w:t xml:space="preserve">5. Click the black "Save" button in the top-right corner.</w:t>
+            </w:r>
+          </w:p>
+          <w:p>
+            <w:pPr>
+              <w:spacing w:after="60"/>
+            </w:pPr>
+            <w:r>
+              <w:rPr>
+                <w:b w:val="false"/>
+                <w:bCs w:val="false"/>
+                <w:color w:val="334155"/>
+                <w:sz w:val="21"/>
+                <w:szCs w:val="21"/>
+              </w:rPr>
+              <w:t xml:space="preserve">6. Wait 1–2 minutes, then refresh your live website to see changes.</w:t>
+            </w:r>
+          </w:p>
+        </w:tc>
+      </w:tr>
+    </w:tbl>
+    <w:p>
+      <w:pPr>
+        <w:pStyle w:val="Heading2"/>
+        <w:spacing w:after="140" w:before="300"/>
+      </w:pPr>
+      <w:r>
+        <w:rPr>
+          <w:b/>
+          <w:bCs/>
+          <w:color w:val="1E3A8A"/>
+          <w:sz w:val="28"/>
+          <w:szCs w:val="28"/>
+        </w:rPr>
+        <w:t xml:space="preserve">5. Page-by-Page Field Reference</w:t>
       </w:r>
     </w:p>
     <w:p>
@@ -861,7 +1069,7 @@
                 <w:sz w:val="20"/>
                 <w:szCs w:val="20"/>
               </w:rPr>
-              <w:t xml:space="preserve">Cover Image</w:t>
+              <w:t xml:space="preserve">Cover Image (click to choose from Media Library)</w:t>
             </w:r>
           </w:p>
         </w:tc>
@@ -1024,6 +1232,60 @@
                 <w:szCs w:val="20"/>
               </w:rPr>
               <w:t xml:space="preserve">Breakfast Description &amp; Times</w:t>
+            </w:r>
+          </w:p>
+        </w:tc>
+      </w:tr>
+      <w:tr>
+        <w:tc>
+          <w:tcPr>
+            <w:tcBorders>
+              <w:top w:val="single" w:color="E2E8F0" w:sz="4"/>
+              <w:left w:val="single" w:color="E2E8F0" w:sz="4"/>
+              <w:bottom w:val="single" w:color="E2E8F0" w:sz="4"/>
+              <w:right w:val="single" w:color="E2E8F0" w:sz="4"/>
+            </w:tcBorders>
+            <w:shd w:fill="FFFFFF" w:val="clear"/>
+            <w:tcMar>
+              <w:top w:type="dxa" w:w="100"/>
+              <w:left w:type="dxa" w:w="140"/>
+              <w:bottom w:type="dxa" w:w="100"/>
+              <w:right w:type="dxa" w:w="140"/>
+            </w:tcMar>
+          </w:tcPr>
+          <w:p>
+            <w:r>
+              <w:rPr>
+                <w:sz w:val="20"/>
+                <w:szCs w:val="20"/>
+              </w:rPr>
+              <w:t xml:space="preserve">Downloadable PDF Menus</w:t>
+            </w:r>
+          </w:p>
+        </w:tc>
+        <w:tc>
+          <w:tcPr>
+            <w:tcBorders>
+              <w:top w:val="single" w:color="E2E8F0" w:sz="4"/>
+              <w:left w:val="single" w:color="E2E8F0" w:sz="4"/>
+              <w:bottom w:val="single" w:color="E2E8F0" w:sz="4"/>
+              <w:right w:val="single" w:color="E2E8F0" w:sz="4"/>
+            </w:tcBorders>
+            <w:shd w:fill="FFFFFF" w:val="clear"/>
+            <w:tcMar>
+              <w:top w:type="dxa" w:w="100"/>
+              <w:left w:type="dxa" w:w="140"/>
+              <w:bottom w:type="dxa" w:w="100"/>
+              <w:right w:type="dxa" w:w="140"/>
+            </w:tcMar>
+          </w:tcPr>
+          <w:p>
+            <w:r>
+              <w:rPr>
+                <w:sz w:val="20"/>
+                <w:szCs w:val="20"/>
+              </w:rPr>
+              <w:t xml:space="preserve">Managed via https://theshipinnporlockweir.co.uk/admin/menus</w:t>
             </w:r>
           </w:p>
         </w:tc>
@@ -1343,20 +1605,7 @@
           <w:sz w:val="28"/>
           <w:szCs w:val="28"/>
         </w:rPr>
-        <w:t xml:space="preserve">6. How to Manage &amp; Upload Menus</w:t>
-      </w:r>
-    </w:p>
-    <w:p>
-      <w:r>
-        <w:rPr>
-          <w:b/>
-          <w:bCs/>
-          <w:color w:val="D97706"/>
-        </w:rPr>
-        <w:t xml:space="preserve">⚠️ Requirement: </w:t>
-      </w:r>
-      <w:r>
-        <w:t xml:space="preserve">Menus must be in PDF format (.pdf). Word files or images should be exported/saved as PDF before uploading.</w:t>
+        <w:t xml:space="preserve">6. How to Add a New Event or News Article</w:t>
       </w:r>
     </w:p>
     <w:tbl>
@@ -1397,28 +1646,13 @@
             </w:pPr>
             <w:r>
               <w:rPr>
-                <w:b/>
-                <w:bCs/>
-                <w:color w:val="1E3A8A"/>
-                <w:sz w:val="21"/>
-                <w:szCs w:val="21"/>
-              </w:rPr>
-              <w:t xml:space="preserve">Method 1: One-Click Menu Manager (Recommended)</w:t>
-            </w:r>
-          </w:p>
-          <w:p>
-            <w:pPr>
-              <w:spacing w:after="60"/>
-            </w:pPr>
-            <w:r>
-              <w:rPr>
                 <w:b w:val="false"/>
                 <w:bCs w:val="false"/>
                 <w:color w:val="334155"/>
                 <w:sz w:val="21"/>
                 <w:szCs w:val="21"/>
               </w:rPr>
-              <w:t xml:space="preserve">1. Go to: https://theshipinnporlockweir.co.uk/admin/menus</w:t>
+              <w:t xml:space="preserve">1. Click Events or News in the left sidebar of Outstatic.</w:t>
             </w:r>
           </w:p>
           <w:p>
@@ -1433,7 +1667,7 @@
                 <w:sz w:val="21"/>
                 <w:szCs w:val="21"/>
               </w:rPr>
-              <w:t xml:space="preserve">2. Select the menu (Breakfast Menu, Lunch Menu, Evening Menu, Sunday Lunch Menu, or Custom Menu).</w:t>
+              <w:t xml:space="preserve">2. Click the black "New" button in the top right.</w:t>
             </w:r>
           </w:p>
           <w:p>
@@ -1448,7 +1682,7 @@
                 <w:sz w:val="21"/>
                 <w:szCs w:val="21"/>
               </w:rPr>
-              <w:t xml:space="preserve">3. Enter the Season / Subtitle (e.g. "Autumn 2026" or "Served 12:00 PM – 3:00 PM").</w:t>
+              <w:t xml:space="preserve">3. In the centre screen: Type your headline in the Title box and write your story or event description below it.</w:t>
             </w:r>
           </w:p>
           <w:p>
@@ -1463,7 +1697,7 @@
                 <w:sz w:val="21"/>
                 <w:szCs w:val="21"/>
               </w:rPr>
-              <w:t xml:space="preserve">4. Click "Browse PDF file" and choose your .pdf file.</w:t>
+              <w:t xml:space="preserve">4. In the right sidebar: Select the Date, upload a Cover Image, and enter a short Description.</w:t>
             </w:r>
           </w:p>
           <w:p>
@@ -1478,102 +1712,7 @@
                 <w:sz w:val="21"/>
                 <w:szCs w:val="21"/>
               </w:rPr>
-              <w:t xml:space="preserve">5. Click "Upload &amp; Publish Menu". Live website &amp; Outstatic update automatically in 1–2 minutes!</w:t>
-            </w:r>
-          </w:p>
-        </w:tc>
-      </w:tr>
-    </w:tbl>
-    <w:tbl>
-      <w:tblPr>
-        <w:tblW w:type="pct" w:w="100%"/>
-        <w:tblBorders>
-          <w:top w:val="single" w:color="auto" w:sz="4"/>
-          <w:left w:val="single" w:color="auto" w:sz="4"/>
-          <w:bottom w:val="single" w:color="auto" w:sz="4"/>
-          <w:right w:val="single" w:color="auto" w:sz="4"/>
-          <w:insideH w:val="single" w:color="auto" w:sz="4"/>
-          <w:insideV w:val="single" w:color="auto" w:sz="4"/>
-        </w:tblBorders>
-      </w:tblPr>
-      <w:tblGrid>
-        <w:gridCol w:w="100"/>
-      </w:tblGrid>
-      <w:tr>
-        <w:tc>
-          <w:tcPr>
-            <w:tcBorders>
-              <w:top w:val="single" w:color="E2E8F0" w:sz="6"/>
-              <w:left w:val="single" w:color="1E3A8A" w:sz="24"/>
-              <w:bottom w:val="single" w:color="E2E8F0" w:sz="6"/>
-              <w:right w:val="single" w:color="E2E8F0" w:sz="6"/>
-            </w:tcBorders>
-            <w:shd w:fill="F8FAFC" w:val="clear"/>
-            <w:tcMar>
-              <w:top w:type="dxa" w:w="140"/>
-              <w:left w:type="dxa" w:w="200"/>
-              <w:bottom w:type="dxa" w:w="140"/>
-              <w:right w:type="dxa" w:w="200"/>
-            </w:tcMar>
-          </w:tcPr>
-          <w:p>
-            <w:pPr>
-              <w:spacing w:after="60"/>
-            </w:pPr>
-            <w:r>
-              <w:rPr>
-                <w:b/>
-                <w:bCs/>
-                <w:color w:val="1E3A8A"/>
-                <w:sz w:val="21"/>
-                <w:szCs w:val="21"/>
-              </w:rPr>
-              <w:t xml:space="preserve">Method 2: Managing via Outstatic Dashboard</w:t>
-            </w:r>
-          </w:p>
-          <w:p>
-            <w:pPr>
-              <w:spacing w:after="60"/>
-            </w:pPr>
-            <w:r>
-              <w:rPr>
-                <w:b w:val="false"/>
-                <w:bCs w:val="false"/>
-                <w:color w:val="334155"/>
-                <w:sz w:val="21"/>
-                <w:szCs w:val="21"/>
-              </w:rPr>
-              <w:t xml:space="preserve">1. Click Menus in the left sidebar of Outstatic.</w:t>
-            </w:r>
-          </w:p>
-          <w:p>
-            <w:pPr>
-              <w:spacing w:after="60"/>
-            </w:pPr>
-            <w:r>
-              <w:rPr>
-                <w:b w:val="false"/>
-                <w:bCs w:val="false"/>
-                <w:color w:val="334155"/>
-                <w:sz w:val="21"/>
-                <w:szCs w:val="21"/>
-              </w:rPr>
-              <w:t xml:space="preserve">2. Click any menu to edit its subtitle, display order, or toggle Status from Published to Draft (to temporarily hide a menu).</w:t>
-            </w:r>
-          </w:p>
-          <w:p>
-            <w:pPr>
-              <w:spacing w:after="60"/>
-            </w:pPr>
-            <w:r>
-              <w:rPr>
-                <w:b w:val="false"/>
-                <w:bCs w:val="false"/>
-                <w:color w:val="334155"/>
-                <w:sz w:val="21"/>
-                <w:szCs w:val="21"/>
-              </w:rPr>
-              <w:t xml:space="preserve">3. Click Save.</w:t>
+              <w:t xml:space="preserve">5. Set Status to "Published" and click Save.</w:t>
             </w:r>
           </w:p>
         </w:tc>
@@ -1592,399 +1731,7 @@
           <w:sz w:val="28"/>
           <w:szCs w:val="28"/>
         </w:rPr>
-        <w:t xml:space="preserve">7. How to Manage the Photo Gallery</w:t>
-      </w:r>
-    </w:p>
-    <w:tbl>
-      <w:tblPr>
-        <w:tblW w:type="pct" w:w="100%"/>
-        <w:tblBorders>
-          <w:top w:val="single" w:color="auto" w:sz="4"/>
-          <w:left w:val="single" w:color="auto" w:sz="4"/>
-          <w:bottom w:val="single" w:color="auto" w:sz="4"/>
-          <w:right w:val="single" w:color="auto" w:sz="4"/>
-          <w:insideH w:val="single" w:color="auto" w:sz="4"/>
-          <w:insideV w:val="single" w:color="auto" w:sz="4"/>
-        </w:tblBorders>
-      </w:tblPr>
-      <w:tblGrid>
-        <w:gridCol w:w="100"/>
-      </w:tblGrid>
-      <w:tr>
-        <w:tc>
-          <w:tcPr>
-            <w:tcBorders>
-              <w:top w:val="single" w:color="E2E8F0" w:sz="6"/>
-              <w:left w:val="single" w:color="1E3A8A" w:sz="24"/>
-              <w:bottom w:val="single" w:color="E2E8F0" w:sz="6"/>
-              <w:right w:val="single" w:color="E2E8F0" w:sz="6"/>
-            </w:tcBorders>
-            <w:shd w:fill="F8FAFC" w:val="clear"/>
-            <w:tcMar>
-              <w:top w:type="dxa" w:w="140"/>
-              <w:left w:type="dxa" w:w="200"/>
-              <w:bottom w:type="dxa" w:w="140"/>
-              <w:right w:type="dxa" w:w="200"/>
-            </w:tcMar>
-          </w:tcPr>
-          <w:p>
-            <w:pPr>
-              <w:spacing w:after="60"/>
-            </w:pPr>
-            <w:r>
-              <w:rPr>
-                <w:b/>
-                <w:bCs/>
-                <w:color w:val="1E3A8A"/>
-                <w:sz w:val="21"/>
-                <w:szCs w:val="21"/>
-              </w:rPr>
-              <w:t xml:space="preserve">Method 1: Dedicated Gallery Manager (Recommended)</w:t>
-            </w:r>
-          </w:p>
-          <w:p>
-            <w:pPr>
-              <w:spacing w:after="60"/>
-            </w:pPr>
-            <w:r>
-              <w:rPr>
-                <w:b w:val="false"/>
-                <w:bCs w:val="false"/>
-                <w:color w:val="334155"/>
-                <w:sz w:val="21"/>
-                <w:szCs w:val="21"/>
-              </w:rPr>
-              <w:t xml:space="preserve">1. Go to: https://theshipinnporlockweir.co.uk/admin/gallery</w:t>
-            </w:r>
-          </w:p>
-          <w:p>
-            <w:pPr>
-              <w:spacing w:after="60"/>
-            </w:pPr>
-            <w:r>
-              <w:rPr>
-                <w:b w:val="false"/>
-                <w:bCs w:val="false"/>
-                <w:color w:val="334155"/>
-                <w:sz w:val="21"/>
-                <w:szCs w:val="21"/>
-              </w:rPr>
-              <w:t xml:space="preserve">2. Choose Single Photo Upload or Batch Upload (for uploading multiple photos at once).</w:t>
-            </w:r>
-          </w:p>
-          <w:p>
-            <w:pPr>
-              <w:spacing w:after="60"/>
-            </w:pPr>
-            <w:r>
-              <w:rPr>
-                <w:b w:val="false"/>
-                <w:bCs w:val="false"/>
-                <w:color w:val="334155"/>
-                <w:sz w:val="21"/>
-                <w:szCs w:val="21"/>
-              </w:rPr>
-              <w:t xml:space="preserve">3. Select Category: Food &amp; Drink, Interior &amp; Bar, Exterior &amp; Garden, Rooms &amp; Cabins, Surroundings, or Custom.</w:t>
-            </w:r>
-          </w:p>
-          <w:p>
-            <w:pPr>
-              <w:spacing w:after="60"/>
-            </w:pPr>
-            <w:r>
-              <w:rPr>
-                <w:b w:val="false"/>
-                <w:bCs w:val="false"/>
-                <w:color w:val="334155"/>
-                <w:sz w:val="21"/>
-                <w:szCs w:val="21"/>
-              </w:rPr>
-              <w:t xml:space="preserve">4. Click "Browse Image" to pick your photo (.webp, .jpg, .png, .avif) and preview it.</w:t>
-            </w:r>
-          </w:p>
-          <w:p>
-            <w:pPr>
-              <w:spacing w:after="60"/>
-            </w:pPr>
-            <w:r>
-              <w:rPr>
-                <w:b w:val="false"/>
-                <w:bCs w:val="false"/>
-                <w:color w:val="334155"/>
-                <w:sz w:val="21"/>
-                <w:szCs w:val="21"/>
-              </w:rPr>
-              <w:t xml:space="preserve">5. Enter a Photo Title / Alt Text and optional Caption.</w:t>
-            </w:r>
-          </w:p>
-          <w:p>
-            <w:pPr>
-              <w:spacing w:after="60"/>
-            </w:pPr>
-            <w:r>
-              <w:rPr>
-                <w:b w:val="false"/>
-                <w:bCs w:val="false"/>
-                <w:color w:val="334155"/>
-                <w:sz w:val="21"/>
-                <w:szCs w:val="21"/>
-              </w:rPr>
-              <w:t xml:space="preserve">6. Click "Upload &amp; Publish Image". The photo goes live and syncs with Outstatic!</w:t>
-            </w:r>
-          </w:p>
-        </w:tc>
-      </w:tr>
-    </w:tbl>
-    <w:tbl>
-      <w:tblPr>
-        <w:tblW w:type="pct" w:w="100%"/>
-        <w:tblBorders>
-          <w:top w:val="single" w:color="auto" w:sz="4"/>
-          <w:left w:val="single" w:color="auto" w:sz="4"/>
-          <w:bottom w:val="single" w:color="auto" w:sz="4"/>
-          <w:right w:val="single" w:color="auto" w:sz="4"/>
-          <w:insideH w:val="single" w:color="auto" w:sz="4"/>
-          <w:insideV w:val="single" w:color="auto" w:sz="4"/>
-        </w:tblBorders>
-      </w:tblPr>
-      <w:tblGrid>
-        <w:gridCol w:w="100"/>
-      </w:tblGrid>
-      <w:tr>
-        <w:tc>
-          <w:tcPr>
-            <w:tcBorders>
-              <w:top w:val="single" w:color="E2E8F0" w:sz="6"/>
-              <w:left w:val="single" w:color="1E3A8A" w:sz="24"/>
-              <w:bottom w:val="single" w:color="E2E8F0" w:sz="6"/>
-              <w:right w:val="single" w:color="E2E8F0" w:sz="6"/>
-            </w:tcBorders>
-            <w:shd w:fill="F8FAFC" w:val="clear"/>
-            <w:tcMar>
-              <w:top w:type="dxa" w:w="140"/>
-              <w:left w:type="dxa" w:w="200"/>
-              <w:bottom w:type="dxa" w:w="140"/>
-              <w:right w:type="dxa" w:w="200"/>
-            </w:tcMar>
-          </w:tcPr>
-          <w:p>
-            <w:pPr>
-              <w:spacing w:after="60"/>
-            </w:pPr>
-            <w:r>
-              <w:rPr>
-                <w:b/>
-                <w:bCs/>
-                <w:color w:val="1E3A8A"/>
-                <w:sz w:val="21"/>
-                <w:szCs w:val="21"/>
-              </w:rPr>
-              <w:t xml:space="preserve">Method 2: Managing via Outstatic Dashboard</w:t>
-            </w:r>
-          </w:p>
-          <w:p>
-            <w:pPr>
-              <w:spacing w:after="60"/>
-            </w:pPr>
-            <w:r>
-              <w:rPr>
-                <w:b w:val="false"/>
-                <w:bCs w:val="false"/>
-                <w:color w:val="334155"/>
-                <w:sz w:val="21"/>
-                <w:szCs w:val="21"/>
-              </w:rPr>
-              <w:t xml:space="preserve">1. Click Gallery in the left sidebar.</w:t>
-            </w:r>
-          </w:p>
-          <w:p>
-            <w:pPr>
-              <w:spacing w:after="60"/>
-            </w:pPr>
-            <w:r>
-              <w:rPr>
-                <w:b w:val="false"/>
-                <w:bCs w:val="false"/>
-                <w:color w:val="334155"/>
-                <w:sz w:val="21"/>
-                <w:szCs w:val="21"/>
-              </w:rPr>
-              <w:t xml:space="preserve">2. Click "New" to create a photo entry.</w:t>
-            </w:r>
-          </w:p>
-          <w:p>
-            <w:pPr>
-              <w:spacing w:after="60"/>
-            </w:pPr>
-            <w:r>
-              <w:rPr>
-                <w:b w:val="false"/>
-                <w:bCs w:val="false"/>
-                <w:color w:val="334155"/>
-                <w:sz w:val="21"/>
-                <w:szCs w:val="21"/>
-              </w:rPr>
-              <w:t xml:space="preserve">3. Set Title, Cover Image, and Category in the right sidebar.</w:t>
-            </w:r>
-          </w:p>
-          <w:p>
-            <w:pPr>
-              <w:spacing w:after="60"/>
-            </w:pPr>
-            <w:r>
-              <w:rPr>
-                <w:b w:val="false"/>
-                <w:bCs w:val="false"/>
-                <w:color w:val="334155"/>
-                <w:sz w:val="21"/>
-                <w:szCs w:val="21"/>
-              </w:rPr>
-              <w:t xml:space="preserve">4. Set Status to Published (or Draft to hide) and click Save.</w:t>
-            </w:r>
-          </w:p>
-        </w:tc>
-      </w:tr>
-    </w:tbl>
-    <w:p>
-      <w:pPr>
-        <w:pStyle w:val="Heading2"/>
-        <w:spacing w:after="140" w:before="300"/>
-      </w:pPr>
-      <w:r>
-        <w:rPr>
-          <w:b/>
-          <w:bCs/>
-          <w:color w:val="1E3A8A"/>
-          <w:sz w:val="28"/>
-          <w:szCs w:val="28"/>
-        </w:rPr>
-        <w:t xml:space="preserve">8. How to Add a New Event or News Article</w:t>
-      </w:r>
-    </w:p>
-    <w:tbl>
-      <w:tblPr>
-        <w:tblW w:type="pct" w:w="100%"/>
-        <w:tblBorders>
-          <w:top w:val="single" w:color="auto" w:sz="4"/>
-          <w:left w:val="single" w:color="auto" w:sz="4"/>
-          <w:bottom w:val="single" w:color="auto" w:sz="4"/>
-          <w:right w:val="single" w:color="auto" w:sz="4"/>
-          <w:insideH w:val="single" w:color="auto" w:sz="4"/>
-          <w:insideV w:val="single" w:color="auto" w:sz="4"/>
-        </w:tblBorders>
-      </w:tblPr>
-      <w:tblGrid>
-        <w:gridCol w:w="100"/>
-      </w:tblGrid>
-      <w:tr>
-        <w:tc>
-          <w:tcPr>
-            <w:tcBorders>
-              <w:top w:val="single" w:color="E2E8F0" w:sz="6"/>
-              <w:left w:val="single" w:color="1E3A8A" w:sz="24"/>
-              <w:bottom w:val="single" w:color="E2E8F0" w:sz="6"/>
-              <w:right w:val="single" w:color="E2E8F0" w:sz="6"/>
-            </w:tcBorders>
-            <w:shd w:fill="F8FAFC" w:val="clear"/>
-            <w:tcMar>
-              <w:top w:type="dxa" w:w="140"/>
-              <w:left w:type="dxa" w:w="200"/>
-              <w:bottom w:type="dxa" w:w="140"/>
-              <w:right w:type="dxa" w:w="200"/>
-            </w:tcMar>
-          </w:tcPr>
-          <w:p>
-            <w:pPr>
-              <w:spacing w:after="60"/>
-            </w:pPr>
-            <w:r>
-              <w:rPr>
-                <w:b w:val="false"/>
-                <w:bCs w:val="false"/>
-                <w:color w:val="334155"/>
-                <w:sz w:val="21"/>
-                <w:szCs w:val="21"/>
-              </w:rPr>
-              <w:t xml:space="preserve">1. Click Events or News in the left sidebar of Outstatic.</w:t>
-            </w:r>
-          </w:p>
-          <w:p>
-            <w:pPr>
-              <w:spacing w:after="60"/>
-            </w:pPr>
-            <w:r>
-              <w:rPr>
-                <w:b w:val="false"/>
-                <w:bCs w:val="false"/>
-                <w:color w:val="334155"/>
-                <w:sz w:val="21"/>
-                <w:szCs w:val="21"/>
-              </w:rPr>
-              <w:t xml:space="preserve">2. Click the "New" button in the top right.</w:t>
-            </w:r>
-          </w:p>
-          <w:p>
-            <w:pPr>
-              <w:spacing w:after="60"/>
-            </w:pPr>
-            <w:r>
-              <w:rPr>
-                <w:b w:val="false"/>
-                <w:bCs w:val="false"/>
-                <w:color w:val="334155"/>
-                <w:sz w:val="21"/>
-                <w:szCs w:val="21"/>
-              </w:rPr>
-              <w:t xml:space="preserve">3. In the centre screen: Type your headline in the Title box and write your story/event text below it.</w:t>
-            </w:r>
-          </w:p>
-          <w:p>
-            <w:pPr>
-              <w:spacing w:after="60"/>
-            </w:pPr>
-            <w:r>
-              <w:rPr>
-                <w:b w:val="false"/>
-                <w:bCs w:val="false"/>
-                <w:color w:val="334155"/>
-                <w:sz w:val="21"/>
-                <w:szCs w:val="21"/>
-              </w:rPr>
-              <w:t xml:space="preserve">4. In the right sidebar: Select the Date, upload a Cover Image, and enter a short Description.</w:t>
-            </w:r>
-          </w:p>
-          <w:p>
-            <w:pPr>
-              <w:spacing w:after="60"/>
-            </w:pPr>
-            <w:r>
-              <w:rPr>
-                <w:b w:val="false"/>
-                <w:bCs w:val="false"/>
-                <w:color w:val="334155"/>
-                <w:sz w:val="21"/>
-                <w:szCs w:val="21"/>
-              </w:rPr>
-              <w:t xml:space="preserve">5. Set Status to "Published" and click Save.</w:t>
-            </w:r>
-          </w:p>
-        </w:tc>
-      </w:tr>
-    </w:tbl>
-    <w:p>
-      <w:pPr>
-        <w:pStyle w:val="Heading2"/>
-        <w:spacing w:after="140" w:before="300"/>
-      </w:pPr>
-      <w:r>
-        <w:rPr>
-          <w:b/>
-          <w:bCs/>
-          <w:color w:val="1E3A8A"/>
-          <w:sz w:val="28"/>
-          <w:szCs w:val="28"/>
-        </w:rPr>
-        <w:t xml:space="preserve">9. Quick Summary: Which Tool Should I Use?</w:t>
+        <w:t xml:space="preserve">7. Summary: Which Tool Should I Use?</w:t>
       </w:r>
     </w:p>
     <w:tbl>
@@ -2047,7 +1794,7 @@
                 <w:sz w:val="20"/>
                 <w:szCs w:val="20"/>
               </w:rPr>
-              <w:t xml:space="preserve">Best Tool</w:t>
+              <w:t xml:space="preserve">Recommended Tool</w:t>
             </w:r>
           </w:p>
         </w:tc>
@@ -2178,7 +1925,7 @@
                 <w:sz w:val="20"/>
                 <w:szCs w:val="20"/>
               </w:rPr>
-              <w:t xml:space="preserve">Upload new photos to the gallery</w:t>
+              <w:t xml:space="preserve">Add new photos to the gallery</w:t>
             </w:r>
           </w:p>
         </w:tc>
@@ -2258,7 +2005,7 @@
                 <w:sz w:val="20"/>
                 <w:szCs w:val="20"/>
               </w:rPr>
-              <w:t xml:space="preserve">Edit phone number, address, or hours</w:t>
+              <w:t xml:space="preserve">Temporarily hide a menu or photo</w:t>
             </w:r>
           </w:p>
         </w:tc>
@@ -2284,7 +2031,7 @@
                 <w:sz w:val="20"/>
                 <w:szCs w:val="20"/>
               </w:rPr>
-              <w:t xml:space="preserve">Outstatic Pages (Contact)</w:t>
+              <w:t xml:space="preserve">Outstatic (Switch to Draft)</w:t>
             </w:r>
           </w:p>
         </w:tc>
@@ -2338,7 +2085,7 @@
                 <w:sz w:val="20"/>
                 <w:szCs w:val="20"/>
               </w:rPr>
-              <w:t xml:space="preserve">Add an upcoming live music event</w:t>
+              <w:t xml:space="preserve">Edit phone number, address, or hours</w:t>
             </w:r>
           </w:p>
         </w:tc>
@@ -2364,7 +2111,7 @@
                 <w:sz w:val="20"/>
                 <w:szCs w:val="20"/>
               </w:rPr>
-              <w:t xml:space="preserve">Outstatic Events</w:t>
+              <w:t xml:space="preserve">Outstatic Pages (Contact)</w:t>
             </w:r>
           </w:p>
         </w:tc>
@@ -2418,6 +2165,86 @@
                 <w:sz w:val="20"/>
                 <w:szCs w:val="20"/>
               </w:rPr>
+              <w:t xml:space="preserve">Add an upcoming live music event</w:t>
+            </w:r>
+          </w:p>
+        </w:tc>
+        <w:tc>
+          <w:tcPr>
+            <w:tcBorders>
+              <w:top w:val="single" w:color="E2E8F0" w:sz="4"/>
+              <w:left w:val="single" w:color="E2E8F0" w:sz="4"/>
+              <w:bottom w:val="single" w:color="E2E8F0" w:sz="4"/>
+              <w:right w:val="single" w:color="E2E8F0" w:sz="4"/>
+            </w:tcBorders>
+            <w:shd w:fill="FFFFFF" w:val="clear"/>
+            <w:tcMar>
+              <w:top w:type="dxa" w:w="100"/>
+              <w:left w:type="dxa" w:w="140"/>
+              <w:bottom w:type="dxa" w:w="100"/>
+              <w:right w:type="dxa" w:w="140"/>
+            </w:tcMar>
+          </w:tcPr>
+          <w:p>
+            <w:r>
+              <w:rPr>
+                <w:sz w:val="20"/>
+                <w:szCs w:val="20"/>
+              </w:rPr>
+              <w:t xml:space="preserve">Outstatic Events</w:t>
+            </w:r>
+          </w:p>
+        </w:tc>
+        <w:tc>
+          <w:tcPr>
+            <w:tcBorders>
+              <w:top w:val="single" w:color="E2E8F0" w:sz="4"/>
+              <w:left w:val="single" w:color="E2E8F0" w:sz="4"/>
+              <w:bottom w:val="single" w:color="E2E8F0" w:sz="4"/>
+              <w:right w:val="single" w:color="E2E8F0" w:sz="4"/>
+            </w:tcBorders>
+            <w:shd w:fill="FFFFFF" w:val="clear"/>
+            <w:tcMar>
+              <w:top w:type="dxa" w:w="100"/>
+              <w:left w:type="dxa" w:w="140"/>
+              <w:bottom w:type="dxa" w:w="100"/>
+              <w:right w:type="dxa" w:w="140"/>
+            </w:tcMar>
+          </w:tcPr>
+          <w:p>
+            <w:r>
+              <w:rPr>
+                <w:sz w:val="20"/>
+                <w:szCs w:val="20"/>
+              </w:rPr>
+              <w:t xml:space="preserve">https://theshipinnporlockweir.co.uk/outstatic</w:t>
+            </w:r>
+          </w:p>
+        </w:tc>
+      </w:tr>
+      <w:tr>
+        <w:tc>
+          <w:tcPr>
+            <w:tcBorders>
+              <w:top w:val="single" w:color="E2E8F0" w:sz="4"/>
+              <w:left w:val="single" w:color="E2E8F0" w:sz="4"/>
+              <w:bottom w:val="single" w:color="E2E8F0" w:sz="4"/>
+              <w:right w:val="single" w:color="E2E8F0" w:sz="4"/>
+            </w:tcBorders>
+            <w:shd w:fill="F8FAFC" w:val="clear"/>
+            <w:tcMar>
+              <w:top w:type="dxa" w:w="100"/>
+              <w:left w:type="dxa" w:w="140"/>
+              <w:bottom w:type="dxa" w:w="100"/>
+              <w:right w:type="dxa" w:w="140"/>
+            </w:tcMar>
+          </w:tcPr>
+          <w:p>
+            <w:r>
+              <w:rPr>
+                <w:sz w:val="20"/>
+                <w:szCs w:val="20"/>
+              </w:rPr>
               <w:t xml:space="preserve">Publish a news story or announcement</w:t>
             </w:r>
           </w:p>
@@ -2430,7 +2257,7 @@
               <w:bottom w:val="single" w:color="E2E8F0" w:sz="4"/>
               <w:right w:val="single" w:color="E2E8F0" w:sz="4"/>
             </w:tcBorders>
-            <w:shd w:fill="FFFFFF" w:val="clear"/>
+            <w:shd w:fill="F8FAFC" w:val="clear"/>
             <w:tcMar>
               <w:top w:type="dxa" w:w="100"/>
               <w:left w:type="dxa" w:w="140"/>
@@ -2456,7 +2283,7 @@
               <w:bottom w:val="single" w:color="E2E8F0" w:sz="4"/>
               <w:right w:val="single" w:color="E2E8F0" w:sz="4"/>
             </w:tcBorders>
-            <w:shd w:fill="FFFFFF" w:val="clear"/>
+            <w:shd w:fill="F8FAFC" w:val="clear"/>
             <w:tcMar>
               <w:top w:type="dxa" w:w="100"/>
               <w:left w:type="dxa" w:w="140"/>
@@ -2508,7 +2335,7 @@
           <w:sz w:val="18"/>
           <w:szCs w:val="18"/>
         </w:rPr>
-        <w:t xml:space="preserve">Manual Version 1.5 — Updated 23 September 2026</w:t>
+        <w:t xml:space="preserve">Manual Version 2.0 — Updated 23 September 2026</w:t>
       </w:r>
     </w:p>
     <w:sectPr>

</xml_diff>